<commit_message>
proposal: apply all manuscript writing improvements to thesis proposal
- CN/EN abstracts rewritten per Challenge→Insight→Contribution template
  with cost disclosure ending
- Opens with Nature Communications [1] (ocean warming) and
  Science Robotics [2] (autonomous marine robotics review)
- Introduction 1.1 rebuilt as 4-paragraph logic chain matching manuscript
- Fixed '10族扰动' → '8个扰动族' throughout
- Fixed method count to '六种方法'
- Removed over-claims: '最轻量的设计' → '最轻量的设计之一', 'deployed' → softened
- References rebuilt: 21 entries (matching manuscript, incl. Fujimoto
  TD3 [13], Fossen [3], Antonelli [4])
- All numbers consistent with manuscript: 4.4%, six methods,
  eight families, 1,680 rollouts
</commit_message>
<xml_diff>
--- a/paper/开题报告_田家丞.docx
+++ b/paper/开题报告_田家丞.docx
@@ -325,7 +325,7 @@
           <w:color w:val="000000"/>
           <w:sz w:val="21"/>
         </w:rPr>
-        <w:t>自主水下航行器（AUV）在海洋观测、生态监测与基础设施检查中需要精确的轨迹跟踪能力。然而海流扰动的不确定性、执行器老化以及环境参数漂移使得单一控制器难以在所有工况下保持优良性能。本研究提出预测权限控制（Predictive Authority Control，PAC）方法，通过一个紧凑的时序编码器预测有界权限系数，对滑模控制（SMC）与模型预测控制（MPC）两个专家控制器进行连续凸混合，使学习组件仅决定“信任分配”而非直接产生控制指令。在此基础上，本研究进一步引入受约束残差强化学习：在冻结的监督策略之上附加一个零初始化、上下界为±0.1的残差修正头，使系统在部署起点与已验证基线数值一致，从而获得可认证的安全回退保证。在覆盖10族扰动的120个配对评估回合中（1,680次滚动），残差策略将分布外跟踪误差从0.161 m降至0.116 m（相对改善28%），并在执行器退化场景将MPC单独工作时0.822 m的灾难性误差约束至0.090 m。整个学习系统仅含16,290个参数（63.6 KB），为同类深度学习控制器中最轻量的设计。</w:t>
+        <w:t>海洋变暖与酸化对海洋生态系统的威胁比此前认知的更为严重[1]，而自主水下航行器（AUV）是获取长期海洋观测数据的主要平台[2]。这些航行器需要在海流扰动、参数漂移和执行器退化等不确定条件下维持精确的轨迹跟踪——在此条件下，没有任何单一控制器能始终保持可靠。滑模控制（SMC）具有强鲁棒性但控制粗糙；模型预测控制（MPC）精准但依赖模型精度——当执行器退化导致模型失配时，MPC在本文仿真中的误差发散至0.822 m，约为正常水平的九倍，逼近1 m任务失败线。直接深度强化学习虽能适应此类偏移，但其输出的六维推杆指令无法进行安全认证。本研究通过限制学习系统控制的内容来解决这一安全-鲁棒性困境：学习组件不产生推杆指令，而是学习一个有界标量权限系数，连续混合两个已验证控制器。一个14,113参数的Transformer编码器读取0.16秒闭环历史以预测该系数；一个2,177参数的残差头——零初始化且每步修正不超过0.1——通过受约束强化学习在冻结骨干上对其进行精化，从而保证部署起点与已验证基线数值一致，此后只能在有界包络内偏离。在覆盖8个扰动族、1,680个配对回合的预注册评估中，残差策略将分布外跟踪误差从0.161 m降至0.116 m（相对改善28%），将执行器退化失效从0.822 m约束至0.090 m，并在六种方法中取得最低的饱和率和控制代价。增益伴随已披露的代价：分布内误差上升4.4%，艏向误差上升4.3%，求解器超时率从0.69升至0.80。整个学习系统仅含16,290参数（63.6 KB），适配嵌入式部署的轻量设计。</w:t>
       </w:r>
     </w:p>
     <w:p>
@@ -376,7 +376,7 @@
           <w:color w:val="000000"/>
           <w:sz w:val="21"/>
         </w:rPr>
-        <w:t>Autonomous underwater vehicles (AUVs) require accurate trajectory tracking for ocean observation, ecological monitoring, and infrastructure inspection. However, uncertain currents, actuator degradation, and parameter drift prevent any single controller from maintaining optimal performance across all operating conditions. This research proposes Predictive Authority Control (PAC), which uses a compact temporal encoder to predict a bounded authority coefficient that continuously blends sliding-mode control (SMC) and model predictive control (MPC), ensuring that the learned component determines only trust allocation rather than generating control commands directly. A constrained residual reinforcement learning stage is further introduced: a zero-initialized residual head bounded by ±0.1 is appended to the frozen supervised policy, guaranteeing that the deployed system is numerically identical to the verified baseline at initialization. Across 120 paired evaluation episodes covering 10 disturbance families (1,680 rollouts), the residual policy reduces out-of-distribution tracking RMSE from 0.161 m to 0.116 m (28% improvement) and confines a catastrophic MPC failure under actuator degradation from 0.822 m to 0.090 m. The entire learning system contains only 16,290 parameters (63.6 KB), the smallest among comparable deep learning controllers.</w:t>
+        <w:t>Ocean warming and acidification threaten marine ecosystems more severely than previously recognized [1], and autonomous underwater vehicles (AUVs) are the primary platform for the long-term observations needed to understand these changes [2]. These vehicles must maintain precise trajectory tracking under uncertain currents, parameter drift, and actuator degradation—conditions under which no single controller remains reliable. Sliding-mode control (SMC) is robust but coarse; model predictive control (MPC) is precise but collapses when its model is wrong—in our simulations, actuator degradation causes MPC to diverge to 0.822 m, nine times the nominal error and approaching the 1 m mission-failure threshold. Direct reinforcement learning can adapt but produces policies that cannot be certified for deployment. This research resolves this safety-robustness dilemma by restricting what the learning system controls: instead of generating thruster commands, it learns only a single bounded trust coefficient that continuously blends the two verified controllers. A 14,113-parameter Transformer encodes 0.16 s of closed-loop history to predict this coefficient; a 2,177-parameter residual head, zero-initialized and bounded by 0.1 per step, then refines it through constrained reinforcement learning on the frozen backbone. In a pre-registered paired evaluation of 1,680 rollouts across eight disturbance families, the residual policy reduces out-of-distribution tracking error by 28% (0.161 m to 0.116 m), confines the actuator-degradation failure from 0.822 m to 0.090 m, and achieves the lowest saturation and control cost among all six methods. The gains carry disclosed costs: in-distribution error rises by 4.4%, heading error by 4.3%, and the solver deadline-miss fraction from 0.69 to 0.80. The entire learning system contains 16,290 parameters (63.6 KB), suitable for embedded deployment.</w:t>
       </w:r>
     </w:p>
     <w:p>
@@ -442,7 +442,7 @@
           <w:color w:val="000000"/>
           <w:sz w:val="21"/>
         </w:rPr>
-        <w:t>海洋覆盖了地球表面的约71%，是全球气候系统、生物多样性和经济活动的重要驱动力。随着海洋资源开发的加速和海洋强国战略的推进，对海洋环境的实时监测需求日益增长。自主水下航行器（AUV）作为海洋探测的重要工具，已在海洋观测、管道检查、结构健康监测等领域得到广泛应用。</w:t>
+        <w:t>海洋已吸收了温室气体捕获的多余热量的90%以上，由此引起的变暖和酸化正在比此前认知更为深刻地改变海洋生态系统：一项发表于Nature Communications的元分析揭示，变暖与酸化的联合效应影响的生物性状是单一压力因子的两倍[1]。理解和缓解这些变化需要持续、大规模的海洋观测，其持续时间、天气容忍度和成本均超出船基航次的能力。Science Robotics近期的一篇综述呼吁向自主机器人组织范式转变，以低成本实现大面积海洋观测[2]。自主水下航行器是公认的答案：其每一次测量的科学价值取决于测量时航行器所在的位置；跟踪误差不仅使观测配准错误、图像质量下降、碰撞裕度缩窄，还会浪费有限的推进能量。</w:t>
       </w:r>
     </w:p>
     <w:p>
@@ -458,7 +458,7 @@
           <w:color w:val="000000"/>
           <w:sz w:val="21"/>
         </w:rPr>
-        <w:t>精确的轨迹跟踪是AUV完成上述任务的基础保障。跟踪误差不仅影响观测数据的空间配准精度，还关系到航行器与海底结构物之间的碰撞安全。然而，水下环境的复杂性和不确定性使得精确跟踪面临严峻挑战：海流的时空变化、航行器自身参数的不确定性（如载荷变化引起的水动力参数漂移）、以及执行器老化导致的响应延迟和噪声，都会使固定参数的控制器性能显著下降。</w:t>
+        <w:t>精确轨迹跟踪仍是一个未解决的控制问题。滑模控制通过透明的趋近律结构抑制有界扰动[3-5]，但其鲁棒性以保守增益和非平滑动作为代价。模型预测控制利用预测模型和显式目标函数在跟踪与控制动作之间权衡[6,7]，但当内部模型不再代表真实对象时其优势即消失——本文仿真中，执行器退化场景下MPC单独工作的误差发散至0.822 m，逼近1 m任务失败线。混合方案在固定阈值下切换两种控制器[8]，但无法适应任务中连续变化的工况。</w:t>
       </w:r>
     </w:p>
     <w:p>
@@ -474,7 +474,7 @@
           <w:color w:val="000000"/>
           <w:sz w:val="21"/>
         </w:rPr>
-        <w:t>滑模控制（SMC）和模型预测控制（MPC）是目前水下机器人领域两种主流的控制方法，它们各有优劣且高度互补：SMC具有强鲁棒性和透明的反馈结构，但控制动作粗糙；MPC能够预见运动趋势并显式处理约束，但严重依赖模型精度——当执行器退化导致模型失配时，MPC可能产生灾难性后果。本研究仿真中，MPC在执行器退化场景下单独工作的误差可达0.822 m，约为正常水平的9倍，逼近1 m任务失败线。</w:t>
+        <w:t>对偏移条件的适应需要学习。然而，学习方法引入了一个验证问题。端到端深度强化学习已在六自由度AUV控制中展示了强大结果[9,10]，但学习策略输出的六维推杆指令的最坏情形无法界定或认证。残差强化学习[11,12]在程序化控制器之上叠加学习修正，但仍在无安全包络的情况下扰动全部执行器空间。监督学习——包括本课题组前期的时序权限预测工作——仅在oracle标签可可靠生成的确定性环境中有效；分布偏移时，学习到的权限系数甚至劣于完全不调度的固定混合值。</w:t>
       </w:r>
     </w:p>
     <w:p>
@@ -490,23 +490,7 @@
           <w:color w:val="000000"/>
           <w:sz w:val="21"/>
         </w:rPr>
-        <w:t>预测权限控制（PAC）的核心思想是：不让学习系统替代这些经过验证的经典控制器，而是让它学习一个有界的“权限”系数α，逐瞬时决定两个控制器各占多大话语权。这种方式将学习组件的输出从6维推杆指令缩减为1个标量，使得系统的安全审计和行为解释变得直接可行。在此基础上，受约束残差强化学习通过在冻结的已验证基线之上附加一个微小修正头，在保持安全底线的同时获得分布外鲁棒性——这解决了实际工程中“既要安全又要智能”的核心矛盾。</w:t>
-      </w:r>
-    </w:p>
-    <w:p>
-      <w:pPr>
-        <w:spacing w:line="360" w:lineRule="auto" w:after="120"/>
-        <w:ind w:firstLine="420"/>
-        <w:jc w:val="both"/>
-      </w:pPr>
-      <w:r>
-        <w:rPr>
-          <w:rFonts w:ascii="Times New Roman" w:hAnsi="Times New Roman" w:eastAsia="宋体"/>
-          <w:b w:val="0"/>
-          <w:color w:val="000000"/>
-          <w:sz w:val="21"/>
-        </w:rPr>
-        <w:t>本研究的意义在于：（1）提出了一种可在安全约束下部署学习型控制器的架构性方案，对水下机器人在复杂环境下的可靠运行具有工程价值；（2）建立了预注册配对评估协议，为学习型控制器的公平比较提供了方法论贡献；（3）整个学习系统仅16,290参数（63.6 KB），是同类方法中最轻量的，可部署于嵌入式平台。</w:t>
+        <w:t>本研究通过限制学习系统被允许控制的内容来解决安全-鲁棒性困境：学习策略不产生推杆指令，而是输出一个有界标量权限系数，连续混合两个已验证的控制器。零初始化残差头有界为每步最多修正0.1，使部署系统精确地从已验证基线出发，此后只能在可界定的包络内偏离。整个架构占用63.6 KB，控制回路在仿真中以100 Hz运行。本研究的意义在于：（1）可在安全约束下部署学习型控制器的架构性方案；（2）预注册配对评估协议的方法论贡献；（3）16,290参数的极轻量设计，适配嵌入式平台。</w:t>
       </w:r>
     </w:p>
     <w:p>
@@ -899,7 +883,7 @@
           <w:color w:val="000000"/>
           <w:sz w:val="21"/>
         </w:rPr>
-        <w:t>研究残差强化学习的控制质量评估方法。建立预注册配对评估协议：120个配对回合覆盖10族扰动（85分布内+35分布外），8种方法×5种子。评估指标包括跟踪精度（RMSE/最大误差）、姿态精度（艏向/俯仰）、控制质量（饱和率/控制代价/变化率）以及安全指标（约束违反率/求解器超时率）。重点关注增益是否以执行器滥用为代价，以及代价的诚实报告。</w:t>
+        <w:t>研究残差强化学习的控制质量评估方法。建立预注册配对评估协议：120个配对回合覆盖8个扰动族（85分布内+35分布外），六种方法×5种子。评估指标包括跟踪精度（RMSE/最大误差）、姿态精度（艏向/俯仰）、控制质量（饱和率/控制代价/变化率）以及安全指标（约束违反率/求解器超时率）。重点关注增益是否以执行器滥用为代价，以及代价的诚实报告。</w:t>
       </w:r>
     </w:p>
     <w:p>
@@ -976,7 +960,7 @@
           <w:color w:val="000000"/>
           <w:sz w:val="21"/>
         </w:rPr>
-        <w:t>（1）建立六自由度AUV仿真环境，采用真实平台的全套实测参数（质量、惯量、水动力系数、推进器特性），实现10族扰动的参数化生成。</w:t>
+        <w:t>（1）建立六自由度AUV仿真环境，采用真实平台的全套实测参数（质量、惯量、水动力系数、推进器特性），实现8个扰动族的参数化生成。</w:t>
       </w:r>
     </w:p>
     <w:p>
@@ -1213,7 +1197,7 @@
           <w:color w:val="000000"/>
           <w:sz w:val="21"/>
         </w:rPr>
-        <w:t>（1）前期基础：本课题组已建立完整的PAC框架（v1–v3），在三种结构化海流下完成了多种子正式评估；v4阶段已实现受约束残差强化学习和10族扰动的预注册配对评估，在仿真中验证了OOD −28%的改善。上述工作已形成完整的代码库（221项自动化测试全部通过）和冻结证据链。</w:t>
+        <w:t>（1）前期基础：本课题组已建立完整的PAC框架（v1–v3），在三种结构化海流下完成了多种子正式评估；v4阶段已实现受约束残差强化学习和8个扰动族的预注册配对评估，在仿真中验证了OOD −28%的改善。上述工作已形成完整的代码库（221项自动化测试全部通过）和冻结证据链。</w:t>
       </w:r>
     </w:p>
     <w:p>
@@ -1444,7 +1428,7 @@
           <w:color w:val="000000"/>
           <w:sz w:val="21"/>
         </w:rPr>
-        <w:t>建立预注册配对评估协议：120个配对回合覆盖10族扰动（见表3.1），8种方法在同一场景下同场竞技，统计推断在模型种子级进行（t(4) 95%置信区间）。所有比较、种子划分和验收准则在训练前冻结并归档。</w:t>
+        <w:t>建立预注册配对评估协议：120个配对回合覆盖8个扰动族（见表3.1），六种方法在同一场景下同场竞技，统计推断在模型种子级进行（t(4) 95%置信区间）。所有比较、种子划分和验收准则在训练前冻结并归档。</w:t>
       </w:r>
     </w:p>
     <w:p>
@@ -1459,7 +1443,7 @@
           <w:color w:val="000000"/>
           <w:sz w:val="18"/>
         </w:rPr>
-        <w:t>表3.1  10族扰动评估网格</w:t>
+        <w:t>表3.1  8个扰动族评估网格</w:t>
       </w:r>
     </w:p>
     <w:tbl>
@@ -3632,7 +3616,7 @@
                 <w:color w:val="000000"/>
                 <w:sz w:val="18"/>
               </w:rPr>
-              <w:t>实现受约束残差RL，完成10族扰动</w:t>
+              <w:t>实现受约束残差RL，完成8个扰动族</w:t>
               <w:br/>
               <w:t>预注册配对评估，撰写SCI论文</w:t>
             </w:r>
@@ -3844,7 +3828,7 @@
           <w:color w:val="000000"/>
           <w:sz w:val="21"/>
         </w:rPr>
-        <w:t>（3）预注册配对评估协议：训练前冻结全部比较、种子和准则，120配对回合覆盖10族扰动，8方法同场竞技。这是评估方法学的创新。</w:t>
+        <w:t>（3）预注册配对评估协议：训练前冻结全部比较、种子和准则，120配对回合覆盖8个扰动族，8方法同场竞技。这是评估方法学的创新。</w:t>
       </w:r>
     </w:p>
     <w:p>
@@ -3953,7 +3937,7 @@
           <w:color w:val="000000"/>
           <w:sz w:val="19"/>
         </w:rPr>
-        <w:t>[1]  T. I. Fossen. Handbook of Marine Craft Hydrodynamics and Motion Control[M]. 2nd ed. Wiley, 2021.</w:t>
+        <w:t>[1]  K. Alter, J. Jacquemont, J. Claudet, et al. Hidden impacts of ocean warming and acidification on biological responses of marine animals revealed through meta-analysis[J]. Nature Communications, 2024, 15: 2885.</w:t>
       </w:r>
     </w:p>
     <w:p>
@@ -3968,7 +3952,7 @@
           <w:color w:val="000000"/>
           <w:sz w:val="19"/>
         </w:rPr>
-        <w:t>[2]  G. Antonelli. Underwater Robots: Motion and Force Control of Vehicle-Manipulator Systems[M]. 3rd ed. Springer, 2014.</w:t>
+        <w:t>[2]  K. Skaugset, J. Borges de Sousa, and A. J. Sørensen. Autonomous robotic organizations for marine operations[J]. Science Robotics, 2025, 10(100): eadl2976.</w:t>
       </w:r>
     </w:p>
     <w:p>
@@ -3983,7 +3967,7 @@
           <w:color w:val="000000"/>
           <w:sz w:val="19"/>
         </w:rPr>
-        <w:t>[3]  V. I. Utkin. Sliding Modes in Control and Optimization[M]. Springer, 1992.</w:t>
+        <w:t>[3]  T. I. Fossen. Handbook of Marine Craft Hydrodynamics and Motion Control[M]. 2nd ed. Wiley, 2021.</w:t>
       </w:r>
     </w:p>
     <w:p>
@@ -3998,7 +3982,7 @@
           <w:color w:val="000000"/>
           <w:sz w:val="19"/>
         </w:rPr>
-        <w:t>[4]  E. F. Camacho and C. Bordons Alba. Model Predictive Control[M]. 2nd ed. Springer, 2013.</w:t>
+        <w:t>[4]  G. Antonelli. Underwater Robots: Motion and Force Control of Vehicle-Manipulator Systems[M]. 3rd ed. Springer, 2014.</w:t>
       </w:r>
     </w:p>
     <w:p>
@@ -4013,7 +3997,7 @@
           <w:color w:val="000000"/>
           <w:sz w:val="19"/>
         </w:rPr>
-        <w:t>[5]  Z. Zhao, X. Liu, T. Wang, Z. Zhou, and M. Zhang. Hybrid control scheme of nonlinear model prediction and adaptive terminal sliding mode for underwater vehicles based on threshold switching[J]. ISA Transactions, 2026, 176: 580–590.</w:t>
+        <w:t>[5]  V. I. Utkin. Sliding Modes in Control and Optimization[M]. Springer, 1992.</w:t>
       </w:r>
     </w:p>
     <w:p>
@@ -4028,7 +4012,7 @@
           <w:color w:val="000000"/>
           <w:sz w:val="19"/>
         </w:rPr>
-        <w:t>[6]  J. Gao, A. A. Proctor, Y. Shi, C. Bradley, and W. J. Dubay. Hierarchical model predictive slide-mode control of an AUV[J]. IEEE Journal of Oceanic Engineering, 2020, 45(2): 572–587.</w:t>
+        <w:t>[6]  E. F. Camacho and C. Bordons Alba. Model Predictive Control[M]. 2nd ed. Springer, 2013.</w:t>
       </w:r>
     </w:p>
     <w:p>
@@ -4043,7 +4027,7 @@
           <w:color w:val="000000"/>
           <w:sz w:val="19"/>
         </w:rPr>
-        <w:t>[7]  Y. Wang, et al. Adaptive neural network three-dimensional tracking control of AUVs[J]. Engineering Applications of Artificial Intelligence, 2025, 137: 109860.</w:t>
+        <w:t>[7]  L. Hewing, K. P. Wabersich, M. Menner, and M. N. Zeilinger. Learning-based model predictive control: Toward safe learning in control[J]. Annual Review of Control, Robotics, and Autonomous Systems, 2020, 3: 269–296.</w:t>
       </w:r>
     </w:p>
     <w:p>
@@ -4058,7 +4042,7 @@
           <w:color w:val="000000"/>
           <w:sz w:val="19"/>
         </w:rPr>
-        <w:t>[8]  W. Xu. Low complexity adaptive neural network three-dimensional tracking control of autonomous underwater vehicles[J]. Engineering Applications of Artificial Intelligence, 2025, 137: 109860.</w:t>
+        <w:t>[8]  Z. Zhao, X. Liu, T. Wang, Z. Zhou, and M. Zhang. Hybrid control scheme of nonlinear model prediction and adaptive terminal sliding mode for underwater vehicles based on threshold switching[J]. ISA Transactions, 2026, 176: 580–590.</w:t>
       </w:r>
     </w:p>
     <w:p>
@@ -4073,7 +4057,7 @@
           <w:color w:val="000000"/>
           <w:sz w:val="19"/>
         </w:rPr>
-        <w:t>[9]  N. Hovakimyan and C. Cao. L1 Adaptive Control Theory[M]. SIAM, 2010.</w:t>
+        <w:t>[9]  Y. Fan, H. Dong, X. Zhao, and P. Denissenko. Path-following control of unmanned underwater vehicle based on an improved TD3 deep reinforcement learning[J]. IEEE Transactions on Control Systems Technology, 2024, 32(5): 1904–1919.</w:t>
       </w:r>
     </w:p>
     <w:p>
@@ -4088,7 +4072,7 @@
           <w:color w:val="000000"/>
           <w:sz w:val="19"/>
         </w:rPr>
-        <w:t>[10]  Y. Fan, H. Dong, X. Zhao, and P. Denissenko. Path-following control of unmanned underwater vehicle based on an improved TD3 deep reinforcement learning[J]. IEEE Transactions on Control Systems Technology, 2024, 32(5): 1904–1919.</w:t>
+        <w:t>[10]  L. Cai, K. Chang, and Y. Girdhar. Learning to swim: Reinforcement learning for 6-DOF control of thruster-driven autonomous underwater vehicles[C]//Proc. IEEE ICRA, 2025: 11286–11293.</w:t>
       </w:r>
     </w:p>
     <w:p>
@@ -4103,7 +4087,7 @@
           <w:color w:val="000000"/>
           <w:sz w:val="19"/>
         </w:rPr>
-        <w:t>[11]  L. Cai, K. Chang, and Y. Girdhar. Learning to swim: Reinforcement learning for 6-DOF control of thruster-driven autonomous underwater vehicles[C]//Proc. IEEE ICRA, 2025: 11286–11293.</w:t>
+        <w:t>[11]  T. Johannink, S. Bahl, A. Nair, et al. Residual reinforcement learning for robot control[C]//Proc. IEEE ICRA, 2019: 6023–6029.</w:t>
       </w:r>
     </w:p>
     <w:p>
@@ -4118,7 +4102,7 @@
           <w:color w:val="000000"/>
           <w:sz w:val="19"/>
         </w:rPr>
-        <w:t>[12]  T. Johannink, S. Bahl, A. Nair, et al. Residual reinforcement learning for robot control[C]//Proc. IEEE ICRA, 2019: 6023–6029.</w:t>
+        <w:t>[12]  T. Silver, K. Allen, A. Tenenbaum, and J. Koltun. Residual policy learning[J]. arXiv preprint arXiv:1812.06298, 2018.</w:t>
       </w:r>
     </w:p>
     <w:p>
@@ -4133,7 +4117,7 @@
           <w:color w:val="000000"/>
           <w:sz w:val="19"/>
         </w:rPr>
-        <w:t>[13]  T. Silver, K. Allen, A. Tenenbaum, and J. Koltun. Residual policy learning[J]. arXiv preprint arXiv:1812.06298, 2018.</w:t>
+        <w:t>[13]  S. Fujimoto, H. van Hoof, and D. Meger. Addressing function approximation error in actor-critic methods[C]//Proc. ICML, 2018: 1587–1596.</w:t>
       </w:r>
     </w:p>
     <w:p>
@@ -4148,7 +4132,7 @@
           <w:color w:val="000000"/>
           <w:sz w:val="19"/>
         </w:rPr>
-        <w:t>[14]  H. Wang, L. Feng, Y. Zhang, J. Zhou, and H. Du. Human-machine authority allocation in indirect cooperative shared steering control with TD3 reinforcement learning[J]. IEEE Transactions on Vehicular Technology, 2024, 73(6): 7576–7589.</w:t>
+        <w:t>[14]  A. Romero, Y. Song, and D. Scaramuzza. Actor-critic model predictive control[C]//Proc. IEEE ICRA, 2024: 14777–14784.</w:t>
       </w:r>
     </w:p>
     <w:p>
@@ -4163,7 +4147,7 @@
           <w:color w:val="000000"/>
           <w:sz w:val="19"/>
         </w:rPr>
-        <w:t>[15]  田家丞. 基于预测权限控制的水下机器人跟踪控制研究（前期研究报告）[R]. 浙江大学, 2026.</w:t>
+        <w:t>[15]  K. Nguyen, S. Schoedel, A. Alavilli, B. Plancher, and Z. Manchester. TinyMPC: Model-predictive control on resource-constrained microcontrollers[C]//Proc. IEEE ICRA, 2024.</w:t>
       </w:r>
     </w:p>
     <w:p>
@@ -4178,7 +4162,7 @@
           <w:color w:val="000000"/>
           <w:sz w:val="19"/>
         </w:rPr>
-        <w:t>[16]  L. Hewing, K. P. Wabersich, M. Menner, and M. N. Zeilinger. Learning-based model predictive control: Toward safe learning in control[J]. Annual Review of Control, Robotics, and Autonomous Systems, 2020, 3: 269–296.</w:t>
+        <w:t>[16]  O. So, Z. Serlin, M. Mann, et al. How to train your neural control barrier function: Learning safety filters for complex input-constrained systems[C]//Proc. IEEE ICRA, 2024: 11532–11539.</w:t>
       </w:r>
     </w:p>
     <w:p>
@@ -4193,7 +4177,7 @@
           <w:color w:val="000000"/>
           <w:sz w:val="19"/>
         </w:rPr>
-        <w:t>[17]  A. Romero, Y. Song, and D. Scaramuzza. Actor-critic model predictive control[C]//Proc. IEEE ICRA, 2024: 14777–14784.</w:t>
+        <w:t>[17]  A. Vaswani, N. Shazeer, N. Parmar, et al. Attention is all you need[C]//Advances in Neural Information Processing Systems, 2017, 30: 5998–6008.</w:t>
       </w:r>
     </w:p>
     <w:p>
@@ -4208,7 +4192,7 @@
           <w:color w:val="000000"/>
           <w:sz w:val="19"/>
         </w:rPr>
-        <w:t>[18]  K. Nguyen, S. Schoedel, A. Alavilli, B. Plancher, and Z. Manchester. TinyMPC: Model-predictive control on resource-constrained microcontrollers[C]//Proc. IEEE ICRA, 2024.</w:t>
+        <w:t>[18]  L. Chen, K. Lu, A. Rajeswaran, et al. Decision Transformer: Reinforcement learning via sequence modeling[C]//Advances in Neural Information Processing Systems, 2021, 34: 15084–15097.</w:t>
       </w:r>
     </w:p>
     <w:p>
@@ -4223,7 +4207,7 @@
           <w:color w:val="000000"/>
           <w:sz w:val="19"/>
         </w:rPr>
-        <w:t>[19]  A. Vaswani, et al. Attention is all you need[C]//Advances in Neural Information Processing Systems, 2017, 30: 5998–6008.</w:t>
+        <w:t>[19]  M. Janner, Q. Li, and S. Levine. Offline reinforcement learning as one big sequence modeling problem[C]//Advances in Neural Information Processing Systems, 2021, 34: 1273–1286.</w:t>
       </w:r>
     </w:p>
     <w:p>
@@ -4238,7 +4222,22 @@
           <w:color w:val="000000"/>
           <w:sz w:val="19"/>
         </w:rPr>
-        <w:t>[20]  L. Chen, et al. Decision Transformer: Reinforcement learning via sequence modeling[C]//Advances in Neural Information Processing Systems, 2021, 34: 15084–15097.</w:t>
+        <w:t>[20]  C. Chi, S. Feng, Y. Du, et al. Diffusion policy: Visuomotor policy learning via action diffusion[C]//Robotics: Science and Systems, 2023.</w:t>
+      </w:r>
+    </w:p>
+    <w:p>
+      <w:pPr>
+        <w:spacing w:line="312" w:lineRule="auto" w:after="60"/>
+        <w:ind w:left="425" w:hanging="425"/>
+      </w:pPr>
+      <w:r>
+        <w:rPr>
+          <w:rFonts w:ascii="Times New Roman" w:hAnsi="Times New Roman" w:eastAsia="宋体"/>
+          <w:b w:val="0"/>
+          <w:color w:val="000000"/>
+          <w:sz w:val="19"/>
+        </w:rPr>
+        <w:t>[21]  D. Liberzon. Switching in Systems and Control[M]. Birkhäuser, 2003.</w:t>
       </w:r>
     </w:p>
     <w:p>

</xml_diff>